<commit_message>
Change buck to have 20uF Cout, increase inductor footprint size
</commit_message>
<xml_diff>
--- a/plan.docx
+++ b/plan.docx
@@ -438,15 +438,7 @@
         <w:ind w:left="360"/>
       </w:pPr>
       <w:r>
-        <w:t xml:space="preserve">Order right now, 4/7 in </w:t>
-      </w:r>
-      <w:proofErr w:type="spellStart"/>
-      <w:r>
-        <w:t>china</w:t>
-      </w:r>
-      <w:proofErr w:type="spellEnd"/>
-      <w:r>
-        <w:t xml:space="preserve">, </w:t>
+        <w:t xml:space="preserve">Order right now, 4/7 in china, </w:t>
       </w:r>
       <w:r>
         <w:t>PCB gets built on 4/10</w:t>
@@ -673,6 +665,55 @@
       </w:r>
       <w:r>
         <w:t xml:space="preserve">, arrive </w:t>
+      </w:r>
+    </w:p>
+    <w:p/>
+    <w:p>
+      <w:pPr>
+        <w:pStyle w:val="ListParagraph"/>
+        <w:numPr>
+          <w:ilvl w:val="0"/>
+          <w:numId w:val="6"/>
+        </w:numPr>
+      </w:pPr>
+      <w:r>
+        <w:t>Double checked LED footprint</w:t>
+      </w:r>
+    </w:p>
+    <w:p>
+      <w:pPr>
+        <w:pStyle w:val="ListParagraph"/>
+        <w:numPr>
+          <w:ilvl w:val="0"/>
+          <w:numId w:val="6"/>
+        </w:numPr>
+      </w:pPr>
+      <w:r>
+        <w:t>Double checked stop mask</w:t>
+      </w:r>
+    </w:p>
+    <w:p>
+      <w:pPr>
+        <w:pStyle w:val="ListParagraph"/>
+        <w:numPr>
+          <w:ilvl w:val="0"/>
+          <w:numId w:val="6"/>
+        </w:numPr>
+      </w:pPr>
+      <w:r>
+        <w:t>Double checked BJT pinout</w:t>
+      </w:r>
+    </w:p>
+    <w:p>
+      <w:pPr>
+        <w:pStyle w:val="ListParagraph"/>
+        <w:numPr>
+          <w:ilvl w:val="0"/>
+          <w:numId w:val="6"/>
+        </w:numPr>
+      </w:pPr>
+      <w:r>
+        <w:t>Double checked switch</w:t>
       </w:r>
     </w:p>
     <w:sectPr>
@@ -690,7 +731,7 @@
   <w:abstractNum w:abstractNumId="0" w15:restartNumberingAfterBreak="0">
     <w:nsid w:val="02424473"/>
     <w:multiLevelType w:val="hybridMultilevel"/>
-    <w:tmpl w:val="7DEC4640"/>
+    <w:tmpl w:val="90D24676"/>
     <w:lvl w:ilvl="0" w:tplc="04090001">
       <w:start w:val="1"/>
       <w:numFmt w:val="bullet"/>

</xml_diff>

<commit_message>
Add errata and future recommendations
</commit_message>
<xml_diff>
--- a/plan.docx
+++ b/plan.docx
@@ -2,6 +2,576 @@
 <file path=word/document.xml><?xml version="1.0" encoding="utf-8"?>
 <w:document xmlns:wpc="http://schemas.microsoft.com/office/word/2010/wordprocessingCanvas" xmlns:cx="http://schemas.microsoft.com/office/drawing/2014/chartex" xmlns:cx1="http://schemas.microsoft.com/office/drawing/2015/9/8/chartex" xmlns:cx2="http://schemas.microsoft.com/office/drawing/2015/10/21/chartex" xmlns:cx3="http://schemas.microsoft.com/office/drawing/2016/5/9/chartex" xmlns:cx4="http://schemas.microsoft.com/office/drawing/2016/5/10/chartex" xmlns:cx5="http://schemas.microsoft.com/office/drawing/2016/5/11/chartex" xmlns:cx6="http://schemas.microsoft.com/office/drawing/2016/5/12/chartex" xmlns:cx7="http://schemas.microsoft.com/office/drawing/2016/5/13/chartex" xmlns:cx8="http://schemas.microsoft.com/office/drawing/2016/5/14/chartex" xmlns:mc="http://schemas.openxmlformats.org/markup-compatibility/2006" xmlns:aink="http://schemas.microsoft.com/office/drawing/2016/ink" xmlns:am3d="http://schemas.microsoft.com/office/drawing/2017/model3d" xmlns:o="urn:schemas-microsoft-com:office:office" xmlns:oel="http://schemas.microsoft.com/office/2019/extlst" xmlns:r="http://schemas.openxmlformats.org/officeDocument/2006/relationships" xmlns:m="http://schemas.openxmlformats.org/officeDocument/2006/math" xmlns:v="urn:schemas-microsoft-com:vml" xmlns:wp14="http://schemas.microsoft.com/office/word/2010/wordprocessingDrawing" xmlns:wp="http://schemas.openxmlformats.org/drawingml/2006/wordprocessingDrawing" xmlns:w10="urn:schemas-microsoft-com:office:word" xmlns:w="http://schemas.openxmlformats.org/wordprocessingml/2006/main" xmlns:w14="http://schemas.microsoft.com/office/word/2010/wordml" xmlns:w15="http://schemas.microsoft.com/office/word/2012/wordml" xmlns:w16cex="http://schemas.microsoft.com/office/word/2018/wordml/cex" xmlns:w16cid="http://schemas.microsoft.com/office/word/2016/wordml/cid" xmlns:w16="http://schemas.microsoft.com/office/word/2018/wordml" xmlns:w16du="http://schemas.microsoft.com/office/word/2023/wordml/word16du" xmlns:w16sdtdh="http://schemas.microsoft.com/office/word/2020/wordml/sdtdatahash" xmlns:w16sdtfl="http://schemas.microsoft.com/office/word/2024/wordml/sdtformatlock" xmlns:w16se="http://schemas.microsoft.com/office/word/2015/wordml/symex" xmlns:wpg="http://schemas.microsoft.com/office/word/2010/wordprocessingGroup" xmlns:wpi="http://schemas.microsoft.com/office/word/2010/wordprocessingInk" xmlns:wne="http://schemas.microsoft.com/office/word/2006/wordml" xmlns:wps="http://schemas.microsoft.com/office/word/2010/wordprocessingShape" mc:Ignorable="w14 w15 w16se w16cid w16 w16cex w16sdtdh w16sdtfl w16du wp14">
   <w:body>
+    <w:p>
+      <w:pPr>
+        <w:pStyle w:val="Heading1"/>
+      </w:pPr>
+      <w:r>
+        <w:t>Errata</w:t>
+      </w:r>
+    </w:p>
+    <w:p>
+      <w:pPr>
+        <w:pStyle w:val="ListParagraph"/>
+        <w:numPr>
+          <w:ilvl w:val="0"/>
+          <w:numId w:val="7"/>
+        </w:numPr>
+      </w:pPr>
+      <w:r>
+        <w:t>Recommendation: Use a AA battery</w:t>
+      </w:r>
+    </w:p>
+    <w:p>
+      <w:pPr>
+        <w:pStyle w:val="ListParagraph"/>
+        <w:numPr>
+          <w:ilvl w:val="0"/>
+          <w:numId w:val="7"/>
+        </w:numPr>
+      </w:pPr>
+      <w:r>
+        <w:t>USB C needs resistors on CC1 and CC2</w:t>
+      </w:r>
+      <w:r>
+        <w:t xml:space="preserve"> to negotiate power</w:t>
+      </w:r>
+      <w:r>
+        <w:t>. Solution: 5.1k each from CC1 and CC2 to ground</w:t>
+      </w:r>
+    </w:p>
+    <w:p>
+      <w:pPr>
+        <w:pStyle w:val="ListParagraph"/>
+        <w:numPr>
+          <w:ilvl w:val="0"/>
+          <w:numId w:val="7"/>
+        </w:numPr>
+      </w:pPr>
+      <w:r>
+        <w:t>Resistors for each LED need to be increased from 470 to something like 1k</w:t>
+      </w:r>
+    </w:p>
+    <w:p>
+      <w:pPr>
+        <w:pStyle w:val="ListParagraph"/>
+        <w:numPr>
+          <w:ilvl w:val="1"/>
+          <w:numId w:val="7"/>
+        </w:numPr>
+      </w:pPr>
+      <w:r>
+        <w:t xml:space="preserve">Voltage across </w:t>
+      </w:r>
+      <w:r>
+        <w:t xml:space="preserve">Green LED resistor at VCC = 5 </w:t>
+      </w:r>
+      <w:r>
+        <w:sym w:font="Wingdings" w:char="F0E0"/>
+      </w:r>
+      <w:r>
+        <w:t xml:space="preserve"> 2.4V </w:t>
+      </w:r>
+      <w:r>
+        <w:sym w:font="Wingdings" w:char="F0E0"/>
+      </w:r>
+      <w:r>
+        <w:t>5.1mA</w:t>
+      </w:r>
+    </w:p>
+    <w:p>
+      <w:pPr>
+        <w:pStyle w:val="ListParagraph"/>
+        <w:numPr>
+          <w:ilvl w:val="1"/>
+          <w:numId w:val="7"/>
+        </w:numPr>
+      </w:pPr>
+      <w:r>
+        <w:t xml:space="preserve">Blue LED </w:t>
+      </w:r>
+      <w:r>
+        <w:sym w:font="Wingdings" w:char="F0E0"/>
+      </w:r>
+      <w:r>
+        <w:t xml:space="preserve"> 2.2V </w:t>
+      </w:r>
+      <w:r>
+        <w:sym w:font="Wingdings" w:char="F0E0"/>
+      </w:r>
+      <w:r>
+        <w:t xml:space="preserve"> </w:t>
+      </w:r>
+      <w:r>
+        <w:t>4.7mA</w:t>
+      </w:r>
+    </w:p>
+    <w:tbl>
+      <w:tblPr>
+        <w:tblStyle w:val="TableGrid"/>
+        <w:tblW w:w="0" w:type="auto"/>
+        <w:tblLook w:val="04A0" w:firstRow="1" w:lastRow="0" w:firstColumn="1" w:lastColumn="0" w:noHBand="0" w:noVBand="1"/>
+      </w:tblPr>
+      <w:tblGrid>
+        <w:gridCol w:w="3116"/>
+        <w:gridCol w:w="3117"/>
+        <w:gridCol w:w="3117"/>
+      </w:tblGrid>
+      <w:tr>
+        <w:tc>
+          <w:tcPr>
+            <w:tcW w:w="3116" w:type="dxa"/>
+            <w:shd w:val="clear" w:color="auto" w:fill="E8E8E8" w:themeFill="background2"/>
+          </w:tcPr>
+          <w:p>
+            <w:pPr>
+              <w:jc w:val="center"/>
+            </w:pPr>
+            <w:r>
+              <w:t>Vcc</w:t>
+            </w:r>
+          </w:p>
+        </w:tc>
+        <w:tc>
+          <w:tcPr>
+            <w:tcW w:w="3117" w:type="dxa"/>
+            <w:shd w:val="clear" w:color="auto" w:fill="E8E8E8" w:themeFill="background2"/>
+          </w:tcPr>
+          <w:p>
+            <w:pPr>
+              <w:jc w:val="center"/>
+            </w:pPr>
+            <w:r>
+              <w:t>5</w:t>
+            </w:r>
+          </w:p>
+        </w:tc>
+        <w:tc>
+          <w:tcPr>
+            <w:tcW w:w="3117" w:type="dxa"/>
+            <w:shd w:val="clear" w:color="auto" w:fill="E8E8E8" w:themeFill="background2"/>
+          </w:tcPr>
+          <w:p>
+            <w:pPr>
+              <w:jc w:val="center"/>
+            </w:pPr>
+            <w:r>
+              <w:t>2.8</w:t>
+            </w:r>
+          </w:p>
+        </w:tc>
+      </w:tr>
+      <w:tr>
+        <w:tc>
+          <w:tcPr>
+            <w:tcW w:w="3116" w:type="dxa"/>
+          </w:tcPr>
+          <w:p>
+            <w:pPr>
+              <w:jc w:val="center"/>
+            </w:pPr>
+            <w:r>
+              <w:t xml:space="preserve">Resistor </w:t>
+            </w:r>
+            <w:r>
+              <w:t>V</w:t>
+            </w:r>
+            <w:r>
+              <w:rPr>
+                <w:vertAlign w:val="subscript"/>
+              </w:rPr>
+              <w:t>Red</w:t>
+            </w:r>
+          </w:p>
+        </w:tc>
+        <w:tc>
+          <w:tcPr>
+            <w:tcW w:w="3117" w:type="dxa"/>
+          </w:tcPr>
+          <w:p>
+            <w:pPr>
+              <w:jc w:val="center"/>
+            </w:pPr>
+          </w:p>
+        </w:tc>
+        <w:tc>
+          <w:tcPr>
+            <w:tcW w:w="3117" w:type="dxa"/>
+          </w:tcPr>
+          <w:p>
+            <w:pPr>
+              <w:jc w:val="center"/>
+            </w:pPr>
+          </w:p>
+        </w:tc>
+      </w:tr>
+      <w:tr>
+        <w:tc>
+          <w:tcPr>
+            <w:tcW w:w="3116" w:type="dxa"/>
+          </w:tcPr>
+          <w:p>
+            <w:pPr>
+              <w:jc w:val="center"/>
+            </w:pPr>
+            <w:r>
+              <w:t xml:space="preserve">Resistor </w:t>
+            </w:r>
+            <w:r>
+              <w:t>V</w:t>
+            </w:r>
+            <w:r>
+              <w:rPr>
+                <w:vertAlign w:val="subscript"/>
+              </w:rPr>
+              <w:t>green</w:t>
+            </w:r>
+          </w:p>
+        </w:tc>
+        <w:tc>
+          <w:tcPr>
+            <w:tcW w:w="3117" w:type="dxa"/>
+          </w:tcPr>
+          <w:p>
+            <w:pPr>
+              <w:jc w:val="center"/>
+            </w:pPr>
+            <w:r>
+              <w:t>2.4</w:t>
+            </w:r>
+          </w:p>
+        </w:tc>
+        <w:tc>
+          <w:tcPr>
+            <w:tcW w:w="3117" w:type="dxa"/>
+          </w:tcPr>
+          <w:p>
+            <w:pPr>
+              <w:jc w:val="center"/>
+            </w:pPr>
+            <w:r>
+              <w:t>0.45</w:t>
+            </w:r>
+          </w:p>
+        </w:tc>
+      </w:tr>
+      <w:tr>
+        <w:tc>
+          <w:tcPr>
+            <w:tcW w:w="3116" w:type="dxa"/>
+          </w:tcPr>
+          <w:p>
+            <w:pPr>
+              <w:jc w:val="center"/>
+              <w:rPr>
+                <w:vertAlign w:val="subscript"/>
+              </w:rPr>
+            </w:pPr>
+            <w:r>
+              <w:t xml:space="preserve">Resistor </w:t>
+            </w:r>
+            <w:r>
+              <w:t>V</w:t>
+            </w:r>
+            <w:r>
+              <w:rPr>
+                <w:vertAlign w:val="subscript"/>
+              </w:rPr>
+              <w:t>blue</w:t>
+            </w:r>
+          </w:p>
+        </w:tc>
+        <w:tc>
+          <w:tcPr>
+            <w:tcW w:w="3117" w:type="dxa"/>
+          </w:tcPr>
+          <w:p>
+            <w:pPr>
+              <w:jc w:val="center"/>
+            </w:pPr>
+            <w:r>
+              <w:t>2.2</w:t>
+            </w:r>
+          </w:p>
+        </w:tc>
+        <w:tc>
+          <w:tcPr>
+            <w:tcW w:w="3117" w:type="dxa"/>
+          </w:tcPr>
+          <w:p>
+            <w:pPr>
+              <w:jc w:val="center"/>
+            </w:pPr>
+            <w:r>
+              <w:t>0.</w:t>
+            </w:r>
+            <w:r>
+              <w:t>24</w:t>
+            </w:r>
+          </w:p>
+        </w:tc>
+      </w:tr>
+      <w:tr>
+        <w:tc>
+          <w:tcPr>
+            <w:tcW w:w="3116" w:type="dxa"/>
+          </w:tcPr>
+          <w:p>
+            <w:pPr>
+              <w:jc w:val="center"/>
+            </w:pPr>
+            <w:r>
+              <w:t xml:space="preserve">Total </w:t>
+            </w:r>
+            <w:r>
+              <w:t>I</w:t>
+            </w:r>
+            <w:r>
+              <w:rPr>
+                <w:vertAlign w:val="subscript"/>
+              </w:rPr>
+              <w:t>Red</w:t>
+            </w:r>
+            <w:r>
+              <w:rPr>
+                <w:vertAlign w:val="subscript"/>
+              </w:rPr>
+              <w:t xml:space="preserve"> </w:t>
+            </w:r>
+            <w:r>
+              <w:t>(mA)</w:t>
+            </w:r>
+          </w:p>
+        </w:tc>
+        <w:tc>
+          <w:tcPr>
+            <w:tcW w:w="3117" w:type="dxa"/>
+          </w:tcPr>
+          <w:p>
+            <w:pPr>
+              <w:jc w:val="center"/>
+            </w:pPr>
+            <w:r>
+              <w:t>272</w:t>
+            </w:r>
+          </w:p>
+        </w:tc>
+        <w:tc>
+          <w:tcPr>
+            <w:tcW w:w="3117" w:type="dxa"/>
+          </w:tcPr>
+          <w:p>
+            <w:pPr>
+              <w:jc w:val="center"/>
+            </w:pPr>
+            <w:r>
+              <w:t>86</w:t>
+            </w:r>
+          </w:p>
+        </w:tc>
+      </w:tr>
+      <w:tr>
+        <w:tc>
+          <w:tcPr>
+            <w:tcW w:w="3116" w:type="dxa"/>
+          </w:tcPr>
+          <w:p>
+            <w:pPr>
+              <w:jc w:val="center"/>
+            </w:pPr>
+            <w:r>
+              <w:t>Total I</w:t>
+            </w:r>
+            <w:r>
+              <w:rPr>
+                <w:vertAlign w:val="subscript"/>
+              </w:rPr>
+              <w:t>Green</w:t>
+            </w:r>
+            <w:r>
+              <w:t xml:space="preserve"> (mA)</w:t>
+            </w:r>
+          </w:p>
+        </w:tc>
+        <w:tc>
+          <w:tcPr>
+            <w:tcW w:w="3117" w:type="dxa"/>
+          </w:tcPr>
+          <w:p>
+            <w:pPr>
+              <w:jc w:val="center"/>
+            </w:pPr>
+            <w:r>
+              <w:t>265</w:t>
+            </w:r>
+          </w:p>
+        </w:tc>
+        <w:tc>
+          <w:tcPr>
+            <w:tcW w:w="3117" w:type="dxa"/>
+          </w:tcPr>
+          <w:p>
+            <w:pPr>
+              <w:jc w:val="center"/>
+            </w:pPr>
+            <w:r>
+              <w:t>53</w:t>
+            </w:r>
+          </w:p>
+        </w:tc>
+      </w:tr>
+      <w:tr>
+        <w:tc>
+          <w:tcPr>
+            <w:tcW w:w="3116" w:type="dxa"/>
+          </w:tcPr>
+          <w:p>
+            <w:pPr>
+              <w:jc w:val="center"/>
+            </w:pPr>
+            <w:r>
+              <w:t>Total I</w:t>
+            </w:r>
+            <w:r>
+              <w:rPr>
+                <w:vertAlign w:val="subscript"/>
+              </w:rPr>
+              <w:t>Blue</w:t>
+            </w:r>
+            <w:r>
+              <w:t xml:space="preserve"> (mA)</w:t>
+            </w:r>
+          </w:p>
+        </w:tc>
+        <w:tc>
+          <w:tcPr>
+            <w:tcW w:w="3117" w:type="dxa"/>
+          </w:tcPr>
+          <w:p>
+            <w:pPr>
+              <w:jc w:val="center"/>
+            </w:pPr>
+            <w:r>
+              <w:t>222</w:t>
+            </w:r>
+          </w:p>
+        </w:tc>
+        <w:tc>
+          <w:tcPr>
+            <w:tcW w:w="3117" w:type="dxa"/>
+          </w:tcPr>
+          <w:p>
+            <w:pPr>
+              <w:jc w:val="center"/>
+            </w:pPr>
+            <w:r>
+              <w:t>29</w:t>
+            </w:r>
+          </w:p>
+        </w:tc>
+      </w:tr>
+    </w:tbl>
+    <w:p/>
+    <w:p>
+      <w:r>
+        <w:t>5V output draws too much power from the coin cell battery, so supply voltage is dropping and VCC cannot be maintained. Fix: Lower Vcc</w:t>
+      </w:r>
+      <w:r>
+        <w:t xml:space="preserve">. This can be done by changing </w:t>
+      </w:r>
+      <w:r>
+        <w:t>R76 to the following:</w:t>
+      </w:r>
+    </w:p>
+    <w:p>
+      <w:pPr>
+        <w:pStyle w:val="ListParagraph"/>
+        <w:numPr>
+          <w:ilvl w:val="0"/>
+          <w:numId w:val="8"/>
+        </w:numPr>
+      </w:pPr>
+      <w:r>
+        <w:t>6</w:t>
+      </w:r>
+      <w:r>
+        <w:t>80</w:t>
+      </w:r>
+      <w:r>
+        <w:t xml:space="preserve">k: </w:t>
+      </w:r>
+      <w:r>
+        <w:t>~</w:t>
+      </w:r>
+      <w:r>
+        <w:t>5v</w:t>
+      </w:r>
+    </w:p>
+    <w:p>
+      <w:pPr>
+        <w:pStyle w:val="ListParagraph"/>
+        <w:numPr>
+          <w:ilvl w:val="0"/>
+          <w:numId w:val="8"/>
+        </w:numPr>
+      </w:pPr>
+      <w:r>
+        <w:t>360k: 2.9V</w:t>
+      </w:r>
+    </w:p>
+    <w:p>
+      <w:pPr>
+        <w:pStyle w:val="ListParagraph"/>
+        <w:numPr>
+          <w:ilvl w:val="0"/>
+          <w:numId w:val="8"/>
+        </w:numPr>
+      </w:pPr>
+      <w:r>
+        <w:t>345k: 2.8V</w:t>
+      </w:r>
+    </w:p>
+    <w:p>
+      <w:pPr>
+        <w:pStyle w:val="ListParagraph"/>
+        <w:numPr>
+          <w:ilvl w:val="0"/>
+          <w:numId w:val="8"/>
+        </w:numPr>
+      </w:pPr>
+      <w:r>
+        <w:t xml:space="preserve">330k: </w:t>
+      </w:r>
+      <w:r>
+        <w:t>2.7V</w:t>
+      </w:r>
+    </w:p>
+    <w:p>
+      <w:pPr>
+        <w:pStyle w:val="ListParagraph"/>
+        <w:numPr>
+          <w:ilvl w:val="0"/>
+          <w:numId w:val="8"/>
+        </w:numPr>
+        <w:rPr>
+          <w:highlight w:val="green"/>
+        </w:rPr>
+      </w:pPr>
+      <w:r>
+        <w:rPr>
+          <w:highlight w:val="green"/>
+        </w:rPr>
+        <w:t>680k/2: ~2.77V</w:t>
+      </w:r>
+    </w:p>
+    <w:p>
+      <w:pPr>
+        <w:pStyle w:val="Heading1"/>
+      </w:pPr>
+      <w:r>
+        <w:t>Development plan</w:t>
+      </w:r>
+    </w:p>
     <w:p>
       <w:pPr>
         <w:ind w:left="360"/>
@@ -107,6 +677,7 @@
         </w:numPr>
       </w:pPr>
       <w:r>
+        <w:lastRenderedPageBreak/>
         <w:t xml:space="preserve">inductor </w:t>
       </w:r>
       <w:r>
@@ -423,7 +994,6 @@
         </w:rPr>
       </w:pPr>
       <w:r>
-        <w:lastRenderedPageBreak/>
         <w:t>Senior banquet is may 2</w:t>
       </w:r>
       <w:r>
@@ -494,6 +1064,7 @@
         <w:ind w:left="360"/>
       </w:pPr>
       <w:r>
+        <w:lastRenderedPageBreak/>
         <w:t xml:space="preserve">1 week turnaround, i.e. shipping on 4/14, arrives </w:t>
       </w:r>
       <w:r>
@@ -714,6 +1285,39 @@
       </w:pPr>
       <w:r>
         <w:t>Double checked switch</w:t>
+      </w:r>
+    </w:p>
+    <w:p/>
+    <w:p>
+      <w:pPr>
+        <w:pStyle w:val="Heading1"/>
+      </w:pPr>
+      <w:r>
+        <w:t>Battery life measurement</w:t>
+      </w:r>
+    </w:p>
+    <w:p>
+      <w:pPr>
+        <w:pStyle w:val="ListParagraph"/>
+        <w:numPr>
+          <w:ilvl w:val="0"/>
+          <w:numId w:val="9"/>
+        </w:numPr>
+      </w:pPr>
+      <w:r>
+        <w:t>Turned on at 3:19PM with 324k resistor (Vcc = 2.66)</w:t>
+      </w:r>
+    </w:p>
+    <w:p>
+      <w:pPr>
+        <w:pStyle w:val="ListParagraph"/>
+        <w:numPr>
+          <w:ilvl w:val="0"/>
+          <w:numId w:val="9"/>
+        </w:numPr>
+      </w:pPr>
+      <w:r>
+        <w:t>Lasts about 40 minutes</w:t>
       </w:r>
     </w:p>
     <w:sectPr>
@@ -842,6 +1446,119 @@
     </w:lvl>
   </w:abstractNum>
   <w:abstractNum w:abstractNumId="1" w15:restartNumberingAfterBreak="0">
+    <w:nsid w:val="04415CAD"/>
+    <w:multiLevelType w:val="hybridMultilevel"/>
+    <w:tmpl w:val="2E8C36DA"/>
+    <w:lvl w:ilvl="0" w:tplc="04090001">
+      <w:start w:val="1"/>
+      <w:numFmt w:val="bullet"/>
+      <w:lvlText w:val=""/>
+      <w:lvlJc w:val="left"/>
+      <w:pPr>
+        <w:ind w:left="720" w:hanging="360"/>
+      </w:pPr>
+      <w:rPr>
+        <w:rFonts w:ascii="Symbol" w:hAnsi="Symbol" w:hint="default"/>
+      </w:rPr>
+    </w:lvl>
+    <w:lvl w:ilvl="1" w:tplc="04090003">
+      <w:start w:val="1"/>
+      <w:numFmt w:val="bullet"/>
+      <w:lvlText w:val="o"/>
+      <w:lvlJc w:val="left"/>
+      <w:pPr>
+        <w:ind w:left="1440" w:hanging="360"/>
+      </w:pPr>
+      <w:rPr>
+        <w:rFonts w:ascii="Courier New" w:hAnsi="Courier New" w:cs="Courier New" w:hint="default"/>
+      </w:rPr>
+    </w:lvl>
+    <w:lvl w:ilvl="2" w:tplc="04090005" w:tentative="1">
+      <w:start w:val="1"/>
+      <w:numFmt w:val="bullet"/>
+      <w:lvlText w:val=""/>
+      <w:lvlJc w:val="left"/>
+      <w:pPr>
+        <w:ind w:left="2160" w:hanging="360"/>
+      </w:pPr>
+      <w:rPr>
+        <w:rFonts w:ascii="Wingdings" w:hAnsi="Wingdings" w:hint="default"/>
+      </w:rPr>
+    </w:lvl>
+    <w:lvl w:ilvl="3" w:tplc="04090001" w:tentative="1">
+      <w:start w:val="1"/>
+      <w:numFmt w:val="bullet"/>
+      <w:lvlText w:val=""/>
+      <w:lvlJc w:val="left"/>
+      <w:pPr>
+        <w:ind w:left="2880" w:hanging="360"/>
+      </w:pPr>
+      <w:rPr>
+        <w:rFonts w:ascii="Symbol" w:hAnsi="Symbol" w:hint="default"/>
+      </w:rPr>
+    </w:lvl>
+    <w:lvl w:ilvl="4" w:tplc="04090003" w:tentative="1">
+      <w:start w:val="1"/>
+      <w:numFmt w:val="bullet"/>
+      <w:lvlText w:val="o"/>
+      <w:lvlJc w:val="left"/>
+      <w:pPr>
+        <w:ind w:left="3600" w:hanging="360"/>
+      </w:pPr>
+      <w:rPr>
+        <w:rFonts w:ascii="Courier New" w:hAnsi="Courier New" w:cs="Courier New" w:hint="default"/>
+      </w:rPr>
+    </w:lvl>
+    <w:lvl w:ilvl="5" w:tplc="04090005" w:tentative="1">
+      <w:start w:val="1"/>
+      <w:numFmt w:val="bullet"/>
+      <w:lvlText w:val=""/>
+      <w:lvlJc w:val="left"/>
+      <w:pPr>
+        <w:ind w:left="4320" w:hanging="360"/>
+      </w:pPr>
+      <w:rPr>
+        <w:rFonts w:ascii="Wingdings" w:hAnsi="Wingdings" w:hint="default"/>
+      </w:rPr>
+    </w:lvl>
+    <w:lvl w:ilvl="6" w:tplc="04090001" w:tentative="1">
+      <w:start w:val="1"/>
+      <w:numFmt w:val="bullet"/>
+      <w:lvlText w:val=""/>
+      <w:lvlJc w:val="left"/>
+      <w:pPr>
+        <w:ind w:left="5040" w:hanging="360"/>
+      </w:pPr>
+      <w:rPr>
+        <w:rFonts w:ascii="Symbol" w:hAnsi="Symbol" w:hint="default"/>
+      </w:rPr>
+    </w:lvl>
+    <w:lvl w:ilvl="7" w:tplc="04090003" w:tentative="1">
+      <w:start w:val="1"/>
+      <w:numFmt w:val="bullet"/>
+      <w:lvlText w:val="o"/>
+      <w:lvlJc w:val="left"/>
+      <w:pPr>
+        <w:ind w:left="5760" w:hanging="360"/>
+      </w:pPr>
+      <w:rPr>
+        <w:rFonts w:ascii="Courier New" w:hAnsi="Courier New" w:cs="Courier New" w:hint="default"/>
+      </w:rPr>
+    </w:lvl>
+    <w:lvl w:ilvl="8" w:tplc="04090005" w:tentative="1">
+      <w:start w:val="1"/>
+      <w:numFmt w:val="bullet"/>
+      <w:lvlText w:val=""/>
+      <w:lvlJc w:val="left"/>
+      <w:pPr>
+        <w:ind w:left="6480" w:hanging="360"/>
+      </w:pPr>
+      <w:rPr>
+        <w:rFonts w:ascii="Wingdings" w:hAnsi="Wingdings" w:hint="default"/>
+      </w:rPr>
+    </w:lvl>
+  </w:abstractNum>
+  <w:abstractNum w:abstractNumId="2" w15:restartNumberingAfterBreak="0">
     <w:nsid w:val="06C27D79"/>
     <w:multiLevelType w:val="hybridMultilevel"/>
     <w:tmpl w:val="B10EF784"/>
@@ -954,7 +1671,7 @@
       </w:rPr>
     </w:lvl>
   </w:abstractNum>
-  <w:abstractNum w:abstractNumId="2" w15:restartNumberingAfterBreak="0">
+  <w:abstractNum w:abstractNumId="3" w15:restartNumberingAfterBreak="0">
     <w:nsid w:val="25404CC1"/>
     <w:multiLevelType w:val="hybridMultilevel"/>
     <w:tmpl w:val="C3345B4A"/>
@@ -1067,7 +1784,120 @@
       </w:rPr>
     </w:lvl>
   </w:abstractNum>
-  <w:abstractNum w:abstractNumId="3" w15:restartNumberingAfterBreak="0">
+  <w:abstractNum w:abstractNumId="4" w15:restartNumberingAfterBreak="0">
+    <w:nsid w:val="3E20015E"/>
+    <w:multiLevelType w:val="hybridMultilevel"/>
+    <w:tmpl w:val="4B9065D4"/>
+    <w:lvl w:ilvl="0" w:tplc="04090001">
+      <w:start w:val="1"/>
+      <w:numFmt w:val="bullet"/>
+      <w:lvlText w:val=""/>
+      <w:lvlJc w:val="left"/>
+      <w:pPr>
+        <w:ind w:left="720" w:hanging="360"/>
+      </w:pPr>
+      <w:rPr>
+        <w:rFonts w:ascii="Symbol" w:hAnsi="Symbol" w:hint="default"/>
+      </w:rPr>
+    </w:lvl>
+    <w:lvl w:ilvl="1" w:tplc="04090003" w:tentative="1">
+      <w:start w:val="1"/>
+      <w:numFmt w:val="bullet"/>
+      <w:lvlText w:val="o"/>
+      <w:lvlJc w:val="left"/>
+      <w:pPr>
+        <w:ind w:left="1440" w:hanging="360"/>
+      </w:pPr>
+      <w:rPr>
+        <w:rFonts w:ascii="Courier New" w:hAnsi="Courier New" w:cs="Courier New" w:hint="default"/>
+      </w:rPr>
+    </w:lvl>
+    <w:lvl w:ilvl="2" w:tplc="04090005" w:tentative="1">
+      <w:start w:val="1"/>
+      <w:numFmt w:val="bullet"/>
+      <w:lvlText w:val=""/>
+      <w:lvlJc w:val="left"/>
+      <w:pPr>
+        <w:ind w:left="2160" w:hanging="360"/>
+      </w:pPr>
+      <w:rPr>
+        <w:rFonts w:ascii="Wingdings" w:hAnsi="Wingdings" w:hint="default"/>
+      </w:rPr>
+    </w:lvl>
+    <w:lvl w:ilvl="3" w:tplc="04090001" w:tentative="1">
+      <w:start w:val="1"/>
+      <w:numFmt w:val="bullet"/>
+      <w:lvlText w:val=""/>
+      <w:lvlJc w:val="left"/>
+      <w:pPr>
+        <w:ind w:left="2880" w:hanging="360"/>
+      </w:pPr>
+      <w:rPr>
+        <w:rFonts w:ascii="Symbol" w:hAnsi="Symbol" w:hint="default"/>
+      </w:rPr>
+    </w:lvl>
+    <w:lvl w:ilvl="4" w:tplc="04090003" w:tentative="1">
+      <w:start w:val="1"/>
+      <w:numFmt w:val="bullet"/>
+      <w:lvlText w:val="o"/>
+      <w:lvlJc w:val="left"/>
+      <w:pPr>
+        <w:ind w:left="3600" w:hanging="360"/>
+      </w:pPr>
+      <w:rPr>
+        <w:rFonts w:ascii="Courier New" w:hAnsi="Courier New" w:cs="Courier New" w:hint="default"/>
+      </w:rPr>
+    </w:lvl>
+    <w:lvl w:ilvl="5" w:tplc="04090005" w:tentative="1">
+      <w:start w:val="1"/>
+      <w:numFmt w:val="bullet"/>
+      <w:lvlText w:val=""/>
+      <w:lvlJc w:val="left"/>
+      <w:pPr>
+        <w:ind w:left="4320" w:hanging="360"/>
+      </w:pPr>
+      <w:rPr>
+        <w:rFonts w:ascii="Wingdings" w:hAnsi="Wingdings" w:hint="default"/>
+      </w:rPr>
+    </w:lvl>
+    <w:lvl w:ilvl="6" w:tplc="04090001" w:tentative="1">
+      <w:start w:val="1"/>
+      <w:numFmt w:val="bullet"/>
+      <w:lvlText w:val=""/>
+      <w:lvlJc w:val="left"/>
+      <w:pPr>
+        <w:ind w:left="5040" w:hanging="360"/>
+      </w:pPr>
+      <w:rPr>
+        <w:rFonts w:ascii="Symbol" w:hAnsi="Symbol" w:hint="default"/>
+      </w:rPr>
+    </w:lvl>
+    <w:lvl w:ilvl="7" w:tplc="04090003" w:tentative="1">
+      <w:start w:val="1"/>
+      <w:numFmt w:val="bullet"/>
+      <w:lvlText w:val="o"/>
+      <w:lvlJc w:val="left"/>
+      <w:pPr>
+        <w:ind w:left="5760" w:hanging="360"/>
+      </w:pPr>
+      <w:rPr>
+        <w:rFonts w:ascii="Courier New" w:hAnsi="Courier New" w:cs="Courier New" w:hint="default"/>
+      </w:rPr>
+    </w:lvl>
+    <w:lvl w:ilvl="8" w:tplc="04090005" w:tentative="1">
+      <w:start w:val="1"/>
+      <w:numFmt w:val="bullet"/>
+      <w:lvlText w:val=""/>
+      <w:lvlJc w:val="left"/>
+      <w:pPr>
+        <w:ind w:left="6480" w:hanging="360"/>
+      </w:pPr>
+      <w:rPr>
+        <w:rFonts w:ascii="Wingdings" w:hAnsi="Wingdings" w:hint="default"/>
+      </w:rPr>
+    </w:lvl>
+  </w:abstractNum>
+  <w:abstractNum w:abstractNumId="5" w15:restartNumberingAfterBreak="0">
     <w:nsid w:val="6D313AFD"/>
     <w:multiLevelType w:val="hybridMultilevel"/>
     <w:tmpl w:val="4BAEE45A"/>
@@ -1180,7 +2010,120 @@
       </w:rPr>
     </w:lvl>
   </w:abstractNum>
-  <w:abstractNum w:abstractNumId="4" w15:restartNumberingAfterBreak="0">
+  <w:abstractNum w:abstractNumId="6" w15:restartNumberingAfterBreak="0">
+    <w:nsid w:val="6E2F4296"/>
+    <w:multiLevelType w:val="hybridMultilevel"/>
+    <w:tmpl w:val="58CE6FE8"/>
+    <w:lvl w:ilvl="0" w:tplc="04090001">
+      <w:start w:val="1"/>
+      <w:numFmt w:val="bullet"/>
+      <w:lvlText w:val=""/>
+      <w:lvlJc w:val="left"/>
+      <w:pPr>
+        <w:ind w:left="720" w:hanging="360"/>
+      </w:pPr>
+      <w:rPr>
+        <w:rFonts w:ascii="Symbol" w:hAnsi="Symbol" w:hint="default"/>
+      </w:rPr>
+    </w:lvl>
+    <w:lvl w:ilvl="1" w:tplc="04090003" w:tentative="1">
+      <w:start w:val="1"/>
+      <w:numFmt w:val="bullet"/>
+      <w:lvlText w:val="o"/>
+      <w:lvlJc w:val="left"/>
+      <w:pPr>
+        <w:ind w:left="1440" w:hanging="360"/>
+      </w:pPr>
+      <w:rPr>
+        <w:rFonts w:ascii="Courier New" w:hAnsi="Courier New" w:cs="Courier New" w:hint="default"/>
+      </w:rPr>
+    </w:lvl>
+    <w:lvl w:ilvl="2" w:tplc="04090005" w:tentative="1">
+      <w:start w:val="1"/>
+      <w:numFmt w:val="bullet"/>
+      <w:lvlText w:val=""/>
+      <w:lvlJc w:val="left"/>
+      <w:pPr>
+        <w:ind w:left="2160" w:hanging="360"/>
+      </w:pPr>
+      <w:rPr>
+        <w:rFonts w:ascii="Wingdings" w:hAnsi="Wingdings" w:hint="default"/>
+      </w:rPr>
+    </w:lvl>
+    <w:lvl w:ilvl="3" w:tplc="04090001" w:tentative="1">
+      <w:start w:val="1"/>
+      <w:numFmt w:val="bullet"/>
+      <w:lvlText w:val=""/>
+      <w:lvlJc w:val="left"/>
+      <w:pPr>
+        <w:ind w:left="2880" w:hanging="360"/>
+      </w:pPr>
+      <w:rPr>
+        <w:rFonts w:ascii="Symbol" w:hAnsi="Symbol" w:hint="default"/>
+      </w:rPr>
+    </w:lvl>
+    <w:lvl w:ilvl="4" w:tplc="04090003" w:tentative="1">
+      <w:start w:val="1"/>
+      <w:numFmt w:val="bullet"/>
+      <w:lvlText w:val="o"/>
+      <w:lvlJc w:val="left"/>
+      <w:pPr>
+        <w:ind w:left="3600" w:hanging="360"/>
+      </w:pPr>
+      <w:rPr>
+        <w:rFonts w:ascii="Courier New" w:hAnsi="Courier New" w:cs="Courier New" w:hint="default"/>
+      </w:rPr>
+    </w:lvl>
+    <w:lvl w:ilvl="5" w:tplc="04090005" w:tentative="1">
+      <w:start w:val="1"/>
+      <w:numFmt w:val="bullet"/>
+      <w:lvlText w:val=""/>
+      <w:lvlJc w:val="left"/>
+      <w:pPr>
+        <w:ind w:left="4320" w:hanging="360"/>
+      </w:pPr>
+      <w:rPr>
+        <w:rFonts w:ascii="Wingdings" w:hAnsi="Wingdings" w:hint="default"/>
+      </w:rPr>
+    </w:lvl>
+    <w:lvl w:ilvl="6" w:tplc="04090001" w:tentative="1">
+      <w:start w:val="1"/>
+      <w:numFmt w:val="bullet"/>
+      <w:lvlText w:val=""/>
+      <w:lvlJc w:val="left"/>
+      <w:pPr>
+        <w:ind w:left="5040" w:hanging="360"/>
+      </w:pPr>
+      <w:rPr>
+        <w:rFonts w:ascii="Symbol" w:hAnsi="Symbol" w:hint="default"/>
+      </w:rPr>
+    </w:lvl>
+    <w:lvl w:ilvl="7" w:tplc="04090003" w:tentative="1">
+      <w:start w:val="1"/>
+      <w:numFmt w:val="bullet"/>
+      <w:lvlText w:val="o"/>
+      <w:lvlJc w:val="left"/>
+      <w:pPr>
+        <w:ind w:left="5760" w:hanging="360"/>
+      </w:pPr>
+      <w:rPr>
+        <w:rFonts w:ascii="Courier New" w:hAnsi="Courier New" w:cs="Courier New" w:hint="default"/>
+      </w:rPr>
+    </w:lvl>
+    <w:lvl w:ilvl="8" w:tplc="04090005" w:tentative="1">
+      <w:start w:val="1"/>
+      <w:numFmt w:val="bullet"/>
+      <w:lvlText w:val=""/>
+      <w:lvlJc w:val="left"/>
+      <w:pPr>
+        <w:ind w:left="6480" w:hanging="360"/>
+      </w:pPr>
+      <w:rPr>
+        <w:rFonts w:ascii="Wingdings" w:hAnsi="Wingdings" w:hint="default"/>
+      </w:rPr>
+    </w:lvl>
+  </w:abstractNum>
+  <w:abstractNum w:abstractNumId="7" w15:restartNumberingAfterBreak="0">
     <w:nsid w:val="73555EF9"/>
     <w:multiLevelType w:val="hybridMultilevel"/>
     <w:tmpl w:val="5FA49DB2"/>
@@ -1293,7 +2236,7 @@
       </w:rPr>
     </w:lvl>
   </w:abstractNum>
-  <w:abstractNum w:abstractNumId="5" w15:restartNumberingAfterBreak="0">
+  <w:abstractNum w:abstractNumId="8" w15:restartNumberingAfterBreak="0">
     <w:nsid w:val="7FAE02C6"/>
     <w:multiLevelType w:val="hybridMultilevel"/>
     <w:tmpl w:val="F1D03B7E"/>
@@ -1407,22 +2350,31 @@
     </w:lvl>
   </w:abstractNum>
   <w:num w:numId="1" w16cid:durableId="857080054">
+    <w:abstractNumId w:val="8"/>
+  </w:num>
+  <w:num w:numId="2" w16cid:durableId="677850077">
     <w:abstractNumId w:val="5"/>
   </w:num>
-  <w:num w:numId="2" w16cid:durableId="677850077">
+  <w:num w:numId="3" w16cid:durableId="844826353">
+    <w:abstractNumId w:val="2"/>
+  </w:num>
+  <w:num w:numId="4" w16cid:durableId="1457064527">
     <w:abstractNumId w:val="3"/>
   </w:num>
-  <w:num w:numId="3" w16cid:durableId="844826353">
-    <w:abstractNumId w:val="1"/>
-  </w:num>
-  <w:num w:numId="4" w16cid:durableId="1457064527">
-    <w:abstractNumId w:val="2"/>
-  </w:num>
   <w:num w:numId="5" w16cid:durableId="1642005406">
-    <w:abstractNumId w:val="4"/>
+    <w:abstractNumId w:val="7"/>
   </w:num>
   <w:num w:numId="6" w16cid:durableId="963345512">
     <w:abstractNumId w:val="0"/>
+  </w:num>
+  <w:num w:numId="7" w16cid:durableId="814570962">
+    <w:abstractNumId w:val="1"/>
+  </w:num>
+  <w:num w:numId="8" w16cid:durableId="456342352">
+    <w:abstractNumId w:val="4"/>
+  </w:num>
+  <w:num w:numId="9" w16cid:durableId="2089960918">
+    <w:abstractNumId w:val="6"/>
   </w:num>
 </w:numbering>
 </file>
@@ -2367,6 +3319,25 @@
       <w:shd w:val="clear" w:color="auto" w:fill="E1DFDD"/>
     </w:rPr>
   </w:style>
+  <w:style w:type="table" w:styleId="TableGrid">
+    <w:name w:val="Table Grid"/>
+    <w:basedOn w:val="TableNormal"/>
+    <w:uiPriority w:val="39"/>
+    <w:rsid w:val="00F819B2"/>
+    <w:pPr>
+      <w:spacing w:after="0" w:line="240" w:lineRule="auto"/>
+    </w:pPr>
+    <w:tblPr>
+      <w:tblBorders>
+        <w:top w:val="single" w:sz="4" w:space="0" w:color="auto"/>
+        <w:left w:val="single" w:sz="4" w:space="0" w:color="auto"/>
+        <w:bottom w:val="single" w:sz="4" w:space="0" w:color="auto"/>
+        <w:right w:val="single" w:sz="4" w:space="0" w:color="auto"/>
+        <w:insideH w:val="single" w:sz="4" w:space="0" w:color="auto"/>
+        <w:insideV w:val="single" w:sz="4" w:space="0" w:color="auto"/>
+      </w:tblBorders>
+    </w:tblPr>
+  </w:style>
 </w:styles>
 </file>
 

</xml_diff>